<commit_message>
PeliHylly: ratkaise tehtävänannon ristiriidat
SQLite on sovittu toteutustapa, ja työviikon 2 vertailu perustelee sen;
poikkeamasta sovitaan ohjaajan kanssa ennen työviikkoa 3. Ohjaaja on asiakkaan
sijainen, kunnes edustaja nimetään. Testitapauksia vähintään 14, niistä 12
ajettu työviikkoon 13 mennessä. kayttajatarinat.md, testimatriisi.md ja
nayttomatriisi.md ovat ensisijaiset paikat. Julkiseen repoon vain roolit.
Lataukset ja odotukset rakennettu uudelleen.

Co-Authored-By: Claude Opus 5.5 <noreply@anthropic.com>
</commit_message>
<xml_diff>
--- a/pelihylly/downloads/nayton-dokumentointipohjat.docx
+++ b/pelihylly/downloads/nayton-dokumentointipohjat.docx
@@ -901,7 +901,7 @@
           <w:sz w:val="21"/>
           <w:szCs w:val="21"/>
         </w:rPr>
-        <w:t xml:space="preserve">Keskustelukumppani, rooli ja pvm:</w:t>
+        <w:t xml:space="preserve">Keskustelukumppanin rooli (ei nimeä) ja pvm:</w:t>
       </w:r>
     </w:p>
     <w:p>
@@ -1025,7 +1025,7 @@
                 <w:sz w:val="19"/>
                 <w:szCs w:val="19"/>
               </w:rPr>
-              <w:t xml:space="preserve">Osallistujat ja roolit</w:t>
+              <w:t xml:space="preserve">Osallistujien roolit (ei nimiä)</w:t>
             </w:r>
           </w:p>
         </w:tc>
@@ -1075,7 +1075,7 @@
                 <w:sz w:val="19"/>
                 <w:szCs w:val="19"/>
               </w:rPr>
-              <w:t xml:space="preserve">Testaajan alkuperäinen havainto (hänen sanoillaan)</w:t>
+              <w:t xml:space="preserve">Testaajan havainto hänen sanoillaan (merkitse rooli, ei nimeä)</w:t>
             </w:r>
           </w:p>
         </w:tc>
@@ -1265,7 +1265,7 @@
           <w:sz w:val="21"/>
           <w:szCs w:val="21"/>
         </w:rPr>
-        <w:t xml:space="preserve">Erota aina testaajan sanat omasta tulkinnastasi.</w:t>
+        <w:t xml:space="preserve">Erota aina testaajan sanat omasta tulkinnastasi. Julkiseen repositoryyn kirjataan henkilöistä vain rooli; nimet ohjaajalle Teamsissa tarvittaessa.</w:t>
       </w:r>
     </w:p>
     <w:p>
@@ -3371,7 +3371,7 @@
           <w:sz w:val="21"/>
           <w:szCs w:val="21"/>
         </w:rPr>
-        <w:t xml:space="preserve">Merkitse jokaiselle testitapaukselle luokka: normaali käyttö, raja tai virhetilanne. Kirjoita odotus ennen testiajoa.</w:t>
+        <w:t xml:space="preserve">Testitapauksia on vähintään 14 koko projektissa, ja niistä vähintään 12 on kirjoitettu ja ajettu työviikkoon 13 mennessä. Merkitse jokaiselle testitapaukselle luokka: normaali käyttö, raja tai virhetilanne. Kirjoita odotus ennen testiajoa.</w:t>
       </w:r>
     </w:p>
     <w:p>

</xml_diff>